<commit_message>
NH housing v1.2: complete 2020-2024 collection from OpenStates bulk universe (289 policy bills, 59 laws) + full-universe certification; corrected brief, rebuilt pack/map/appendices; 2pp verified
Co-authored-by: CaptainWrechols <CaptainWrechols@users.noreply.github.com>
</commit_message>
<xml_diff>
--- a/briefs/new-hampshire/housing-affordability/citizen-v1/citizen-brief.docx
+++ b/briefs/new-hampshire/housing-affordability/citizen-v1/citizen-brief.docx
@@ -86,7 +86,7 @@
           <w:color w:val="444444"/>
           <w:sz w:val="20"/>
         </w:rPr>
-        <w:t>New Hampshire's General Court took up 158 housing bills across the 2020–2026 sessions in this record; 48 became law, two of them by riding the state budget. The record splits sharply by subject. Bills that let more homes be built — in commercial zones, as accessory dwelling units, as manufactured and tiny homes — began passing in 2024 with the HB1400 housing omnibus and accelerated through 2025–2026, usually on cross-party votes. Bills that touch the cost of renting — fee limits, rent registries, voucher protections, notice requirements — died in the House in every session. The money runs on a third track: standalone housing-funding bills almost always die, several after unanimous Senate votes, while the same dollars pass every two years inside HB2, the budget trailer. The 2025–2026 biennium produced 101 of the 158 bills and 22 of the 48 new laws — and also 67 kills and 11 interim studies.</w:t>
+        <w:t>New Hampshire's General Court took up 289 housing bills across the 2020–2026 sessions; 59 became law, two of them by riding the state budget. The record splits sharply by subject. Bills that let more homes be built — in commercial zones, as accessory dwelling units, as manufactured and tiny homes — began passing in 2024 with the HB1400 housing omnibus and accelerated through 2025–2026, usually on cross-party votes, after years of near-identical bills dying. Statewide density mandates still fail every time. Bills that touch the cost of renting died in the House in every session; the fee law that finally passed requires disclosure and refunds, not caps. The money runs on a third track: standalone housing-funding bills almost always die, several after unanimous Senate votes, while the same dollars pass every two years inside HB2, the budget trailer. The 2025–2026 biennium produced 101 of the 289 bills and 22 of the 59 new laws — plus 67 kills and 11 interim studies.</w:t>
       </w:r>
     </w:p>
     <w:p>
@@ -147,7 +147,7 @@
                 <w:color w:val="1A2D4F"/>
                 <w:sz w:val="36"/>
               </w:rPr>
-              <w:t>158</w:t>
+              <w:t>289</w:t>
             </w:r>
           </w:p>
           <w:p>
@@ -192,7 +192,7 @@
                 <w:color w:val="1A2D4F"/>
                 <w:sz w:val="36"/>
               </w:rPr>
-              <w:t>48</w:t>
+              <w:t>59</w:t>
             </w:r>
           </w:p>
           <w:p>
@@ -282,7 +282,7 @@
                 <w:color w:val="1A2D4F"/>
                 <w:sz w:val="28"/>
               </w:rPr>
-              <w:t>3 of 3</w:t>
+              <w:t>4 tries</w:t>
             </w:r>
           </w:p>
           <w:p>
@@ -296,7 +296,7 @@
                 <w:color w:val="666666"/>
                 <w:sz w:val="20"/>
               </w:rPr>
-              <w:t>attempts to ban housing-voucher discrimination died in the House</w:t>
+              <w:t>density mandates failed in 2021, 2022, 2023, and 2024 before the narrower 2025–2026 zoning laws passed</w:t>
             </w:r>
           </w:p>
         </w:tc>
@@ -423,7 +423,7 @@
           <w:color w:val="444444"/>
           <w:sz w:val="20"/>
         </w:rPr>
-        <w:t xml:space="preserve"> The turn came in 2024: HB1400 created tax incentives for converting offices to homes, capped local parking mandates, required boards to accept alternative parking, and let towns fast-track zoning amendments, clearing its conference report 205–149. HB631 (2025) then legalized residential building in commercial zoning — the House rejected a motion to kill it 128–211 — and HB1010 and HB1588 (2026) extended multifamily development on commercial land with housing-infrastructure grant money. The groundwork was earlier: planning and land-use omnibus laws in 2021 and 2022 (SB86, HB1661) and community-revitalization tax relief for housing (SB102, 2021). The most aggressive density versions (SB90, HB1065 of 2026) still died.</w:t>
+        <w:t xml:space="preserve"> The turn came in 2024: HB1400 created tax incentives for converting offices to homes, capped local parking mandates — an idea that had died as HB1098 (2022) — and let towns fast-track zoning amendments, clearing its conference report 205–149. HB631 (2025) legalized residential building in commercial zoning after the same idea died as HB1053 (2024); HB1010 and HB1588 (2026) extended multifamily development on commercial land with housing-infrastructure grant money. HB457 (2025) limited local dwelling-unit restrictions. The most aggressive versions (SB90, HB1065 of 2026) still died.</w:t>
       </w:r>
     </w:p>
     <w:p>
@@ -448,7 +448,7 @@
           <w:color w:val="444444"/>
           <w:sz w:val="20"/>
         </w:rPr>
-        <w:t xml:space="preserve"> HB577 (2025) broadened the ADU definition to include detached units and became law; HB1079 (2026) let ADUs go into non-conforming structures. A 2026 attempt to repeal the ADU statutes (HB1012) died. The financing side has not passed: ADU loan guarantees (HB1662, 2026) died and loan forgiveness (HB604, 2026) sits in interim study.</w:t>
+        <w:t xml:space="preserve"> After an ADU tax exemption (HB1510, 2020), an ADU rules bill (HB189, 2021), and ADUs-by-right (HB423, 2023) all died, HB577 (2025) broadened the ADU definition to include detached units and HB1079 (2026) opened non-conforming structures. A 2026 repeal attempt (HB1012) died; ADU financing bills have not passed.</w:t>
       </w:r>
     </w:p>
     <w:p>
@@ -473,7 +473,7 @@
           <w:color w:val="444444"/>
           <w:sz w:val="20"/>
         </w:rPr>
-        <w:t xml:space="preserve"> HB1361 (2024) requires municipalities to provide realistic opportunities for manufactured housing; SB166 (2025) added sale notice in resident-owned communities; HB1681 (2026) legalized tiny houses and yurts, 242–102 on concurrence.</w:t>
+        <w:t xml:space="preserve"> The record's strongest resident-protection thread: park-sale regulation (SB210, 2022), realistic-opportunity siting requirements (HB1361, 2024), sale notice in resident-owned communities (SB166, 2025) — and, after tiny-house codes died in 2020, 2021, and 2022, tiny houses and yurts legalized by HB1681 (2026), 242–102 on concurrence.</w:t>
       </w:r>
     </w:p>
     <w:p>
@@ -489,7 +489,7 @@
           <w:color w:val="1A2D4F"/>
           <w:sz w:val="20"/>
         </w:rPr>
-        <w:t>Shelter money, once.</w:t>
+        <w:t>Renters, at the edges.</w:t>
       </w:r>
       <w:r>
         <w:rPr>
@@ -498,32 +498,7 @@
           <w:color w:val="444444"/>
           <w:sz w:val="20"/>
         </w:rPr>
-        <w:t xml:space="preserve"> SB406 (2024) put $2.5 million into shelter program rates — the record's only standalone shelter appropriation to pass; the rest moved through HB2.</w:t>
-      </w:r>
-    </w:p>
-    <w:p>
-      <w:pPr>
-        <w:widowControl/>
-        <w:spacing w:before="0" w:after="49" w:lineRule="auto" w:line="247"/>
-        <w:jc w:val="both"/>
-      </w:pPr>
-      <w:r>
-        <w:rPr>
-          <w:rFonts w:ascii="Arial" w:hAnsi="Arial" w:cs="Arial" w:eastAsia="Arial"/>
-          <w:b/>
-          <w:color w:val="1A2D4F"/>
-          <w:sz w:val="20"/>
-        </w:rPr>
-        <w:t>Eviction process, not eviction protections.</w:t>
-      </w:r>
-      <w:r>
-        <w:rPr>
-          <w:rFonts w:ascii="Arial" w:hAnsi="Arial" w:cs="Arial" w:eastAsia="Arial"/>
-          <w:b w:val="0"/>
-          <w:color w:val="444444"/>
-          <w:sz w:val="20"/>
-        </w:rPr>
-        <w:t xml:space="preserve"> SB126 (2021) rewrote landlord-tenant court proceedings and passed the Senate 24–0; HB1598 (2026) updated eviction notices and hearings. Both are procedural.</w:t>
+        <w:t xml:space="preserve"> HB283 (2024) makes landlords disclose application fees and refund anything beyond documented costs to applicants who don't get the unit; HB261 (2024) lets tenants end a lease in domestic violence situations; HB360 (2021) legalized shared-living rentals; HB309 (2025) made electronic rent payment optional. SB126 (2021) and HB1598 (2026) updated eviction procedure. SB406 (2024) put $2.5 million into shelter rates — the only standalone shelter money to pass.</w:t>
       </w:r>
     </w:p>
     <w:p>
@@ -548,7 +523,7 @@
           <w:color w:val="444444"/>
           <w:sz w:val="20"/>
         </w:rPr>
-        <w:t xml:space="preserve"> The Housing Appeals Board survived two 2020 repeal-or-replace bills (SB721, SB735). HB92 (2025) added recusal rules for land-board members; HB1359 (2024) settled who counts as an "abutter" able to appeal. Board-training bills died in 2020, 2021, 2022, and 2026.</w:t>
+        <w:t xml:space="preserve"> HB92 (2025) added recusal rules; HB1359 (2024) settled abutter appeals; HB1456 (2024) changed how appeals-board members are appointed and removed. Board-training bills died five times (2020–2026).</w:t>
       </w:r>
     </w:p>
     <w:p>
@@ -580,7 +555,7 @@
           <w:color w:val="1A2D4F"/>
           <w:sz w:val="20"/>
         </w:rPr>
-        <w:t>The statewide ADU mandate — and its milder cousin.</w:t>
+        <w:t>Density mandates, in escalating losses.</w:t>
       </w:r>
       <w:r>
         <w:rPr>
@@ -589,7 +564,7 @@
           <w:color w:val="444444"/>
           <w:sz w:val="20"/>
         </w:rPr>
-        <w:t xml:space="preserve"> HB1291 (2024) — two ADUs per lot by right — passed the House 220–143, with 150 Democrats and 67 Republicans in favor, and the Senate indefinitely postponed it by voice vote after a rescue amendment failed 8–16; the narrower 2025–2026 ADU laws are what survived of it. HB1399 (2024), merely letting towns permit two units in certain single-family zones, passed the House 220–140 and was parked in Senate interim study.</w:t>
+        <w:t xml:space="preserve"> More-units-by-right died in committee in 2021 (HB341), on the table in 2022 (HB1177), 117–232 on the floor in 2023 (HB44), and in 2024 the gentlest version — HB1399, merely letting towns permit second units — passed the House 220–140 and sits in Senate interim study. The two-ADU mandate (HB1291, 2024) passed the House 220–143, with 150 Democrats and 67 Republicans in favor, and the Senate indefinitely postponed it after a rescue amendment failed 8–16.</w:t>
       </w:r>
     </w:p>
     <w:p>
@@ -614,7 +589,7 @@
           <w:color w:val="444444"/>
           <w:sz w:val="20"/>
         </w:rPr>
-        <w:t xml:space="preserve"> Three tries, three stops: SB538 (2024) passed the Senate and was killed on the House floor 188–173; SB84 (2025) passed the Senate 13–10, was carried across the biennium, and ended in interim study; the House versions (HB1008, HB1713, 2026) died at home.</w:t>
+        <w:t xml:space="preserve"> SB538 (2024) passed the Senate and was killed on the House floor 188–173; SB84 (2025) passed the Senate 13–10 and ended in interim study; vesting reform (HB1215, 2024) died when the House rejected its conference report 102–261.</w:t>
       </w:r>
     </w:p>
     <w:p>
@@ -639,7 +614,7 @@
           <w:color w:val="444444"/>
           <w:sz w:val="20"/>
         </w:rPr>
-        <w:t xml:space="preserve"> SB152 (2021) — $10 million for the Affordable Housing Fund — passed the Senate 24–0 and the House killed it; the money rode the budget instead, as did SB231's 2023 housing appropriations. SB454 (2024), doubling the transfer-tax stream to the fund, passed the Senate unanimously and was tabled by the House 180–176 on a division vote, with no roll call recorded. The 2025 retries (HB530, SB81) died at the Senate's own deadline; SB419 (2026) went to interim study; new dedicated taxes (HB1786, HB1707) never got off the House table.</w:t>
+        <w:t xml:space="preserve"> Affordable Housing Fund bills died in 2020 (SB15), 2021 (SB152, after a 24–0 Senate vote), 2024 (SB454, doubling the transfer-tax stream — Senate unanimous, tabled by the House 180–176 on a division vote with no roll call), and 2025 (HB530, SB81, at the Senate's own deadline); SB419 (2026) went to interim study. SB231's 2023 appropriations rode HB2 instead. Also stalled: municipal rental-housing loans (SB384), the historic housing tax credit (SB364), and inclusionary-zoning enabling (SB224), all sent to interim study in 2024.</w:t>
       </w:r>
     </w:p>
     <w:p>
@@ -655,7 +630,7 @@
           <w:color w:val="1A2D4F"/>
           <w:sz w:val="20"/>
         </w:rPr>
-        <w:t>Shelter funding, usually.</w:t>
+        <w:t>The Housing Appeals Board fight.</w:t>
       </w:r>
       <w:r>
         <w:rPr>
@@ -664,7 +639,7 @@
           <w:color w:val="444444"/>
           <w:sz w:val="20"/>
         </w:rPr>
-        <w:t xml:space="preserve"> SB415 (2022) was tabled in the Senate 13–11; SB113 (2025) passed the Senate 23–0 and died at the Senate's internal deadline.</w:t>
+        <w:t xml:space="preserve"> Repeal-or-replace bills died in 2020 (SB721, SB735, SB487), 2021 (HB288), and 2022 (HB1216, HB1254, HB1307); the 2024 merger bill (HB1651) died too — then HB2 2025 restructured the board anyway.</w:t>
       </w:r>
     </w:p>
     <w:p>
@@ -689,7 +664,7 @@
           <w:color w:val="444444"/>
           <w:sz w:val="20"/>
         </w:rPr>
-        <w:t xml:space="preserve"> HB1196 (2026) — repealing the Housing Champion program — passed the House 185–166 with Republicans in favor and every voting Democrat opposed; the Senate killed it, and the program survived.</w:t>
+        <w:t xml:space="preserve"> HB1196 (2026) — repealing the Housing Champion program — passed the House 185–166 with Republicans in favor and every voting Democrat opposed; the Senate killed it.</w:t>
       </w:r>
     </w:p>
     <w:p>
@@ -721,31 +696,6 @@
           <w:color w:val="1A2D4F"/>
           <w:sz w:val="20"/>
         </w:rPr>
-        <w:t>Statewide density mandates.</w:t>
-      </w:r>
-      <w:r>
-        <w:rPr>
-          <w:rFonts w:ascii="Arial" w:hAnsi="Arial" w:cs="Arial" w:eastAsia="Arial"/>
-          <w:b w:val="0"/>
-          <w:color w:val="444444"/>
-          <w:sz w:val="20"/>
-        </w:rPr>
-        <w:t xml:space="preserve"> HB44 (2023) — four homes by right on any single-family lot with municipal water and sewer — failed on the House floor 117–232, with Republicans opposed roughly eight to one and Democrats split.</w:t>
-      </w:r>
-    </w:p>
-    <w:p>
-      <w:pPr>
-        <w:widowControl/>
-        <w:spacing w:before="0" w:after="49" w:lineRule="auto" w:line="247"/>
-        <w:jc w:val="both"/>
-      </w:pPr>
-      <w:r>
-        <w:rPr>
-          <w:rFonts w:ascii="Arial" w:hAnsi="Arial" w:cs="Arial" w:eastAsia="Arial"/>
-          <w:b/>
-          <w:color w:val="1A2D4F"/>
-          <w:sz w:val="20"/>
-        </w:rPr>
         <w:t>Voucher protections.</w:t>
       </w:r>
       <w:r>
@@ -755,7 +705,7 @@
           <w:color w:val="444444"/>
           <w:sz w:val="20"/>
         </w:rPr>
-        <w:t xml:space="preserve"> Bills barring landlords from rejecting tenants with housing vouchers died in the House three times — HB1291 (2022, tabled 179–148), HB469 (2023), HB628 (2025).</w:t>
+        <w:t xml:space="preserve"> Discrimination bans died in the House three times (HB1291 2022, tabled 179–148; HB469 2023; HB628 2025); the incentive version (SB518, 2024) went to interim study.</w:t>
       </w:r>
     </w:p>
     <w:p>
@@ -780,7 +730,7 @@
           <w:color w:val="444444"/>
           <w:sz w:val="20"/>
         </w:rPr>
-        <w:t xml:space="preserve"> Municipal rental regulation (HB95, 2023) lost 301–63. Rent-increase notice (HB567, 2023), the rent registry and algorithm ban (HB558, 2025), application-fee limits (HB1371, HB1375), the price-fixing-software ban (HB1612), pet-fee rules (HB1553), and mold standards (HB1143, all 2026) died in the House. What passed instead is narrow — optional electronic rent payment (HB309, 2025) — and the one deposit bill that cleared both chambers ran the other way: HB1336 (2026), loosening the security-deposit cap, was vetoed, with the override pending this fall.</w:t>
+        <w:t xml:space="preserve"> Rent-increase notice died three times (HB160 2021, HB1200 2022, HB567 2023); the public rent registry twice (HB422 2023, HB558 2025); application-fee caps repeatedly (HB1408 2022; HB1371, HB1375 2026); rent-stabilization enabling once (HB1362, 2024); municipal rental regulation 301–63 (HB95, 2023); and the algorithmic price-fixing bans twice (2025, 2026). The one deposit bill to clear both chambers ran the other way: HB1336 (2026), loosening the security-deposit cap, was vetoed, with the override pending this fall.</w:t>
       </w:r>
     </w:p>
     <w:p>
@@ -796,7 +746,7 @@
           <w:color w:val="1A2D4F"/>
           <w:sz w:val="20"/>
         </w:rPr>
-        <w:t>Tenant notice before a sale.</w:t>
+        <w:t>Tenant protections at key moments.</w:t>
       </w:r>
       <w:r>
         <w:rPr>
@@ -805,7 +755,7 @@
           <w:color w:val="444444"/>
           <w:sz w:val="20"/>
         </w:rPr>
-        <w:t xml:space="preserve"> Notice when a multifamily building changes hands died in 2023 (HB112, 175–199), and again in 2025 (HB444).</w:t>
+        <w:t xml:space="preserve"> Notice before a building's sale died in 2023 (HB112, 175–199) and 2025 (HB444); renovation-eviction limits in 2023 (HB401, 154–213) and 2024 (SB519); eviction legal-counsel notice in 2023 and 2024 (HB379). The landlord-side no-cause lease-expiration termination also failed three times (2021–2024).</w:t>
       </w:r>
     </w:p>
     <w:p>
@@ -837,7 +787,7 @@
           <w:color w:val="444444"/>
           <w:sz w:val="20"/>
         </w:rPr>
-        <w:t>Housing-supply coalitions in this record are cross-party and shift bill by bill: 42 policy bills carried sponsors from both parties, and the commercial-zone laws passed with mixed majorities. The 2021 zoning omnibus SB86 passed the House 208–167 with 196 Republicans in favor and 164 Democrats opposed; three years later the ADU mandate passed the House on the reverse coalition. Tenant-cost bills split on party lines and die on the House floor — the chamber's Inexpedient to Legislate motion is the single largest killer in the set, with 51 housing bills killed in 2026 alone. Some decisive outcomes left no roll call at all — SB454's tabling and HB1291's 2024 Senate death were unrecorded votes. Five 2025 Senate housing bills, several after unanimous votes, died at the Senate's Rule 3-23 deadline rather than on the merits. Since 2020 the Governor has vetoed three housing bills: the COVID eviction pause (HB1247, 2020, override failed 187–148), the manufactured-housing boards bill (SB318, 2024), and the deposit-cap exception (HB1336, 2026). Frequent carriers where sponsor records exist: Reps. Joe Alexander (R) and Ellen Read (D) and Sen. Keith Murphy (R) on seven, six, and five bills respectively.</w:t>
+        <w:t>Housing-supply coalitions are cross-party and shift bill by bill: at least 42 policy bills carried sponsors from both parties, and the commercial-zone laws passed with mixed majorities. The 2021 zoning omnibus SB86 passed the House 208–167 with 196 Republicans in favor and 164 Democrats opposed; three years later the ADU mandate passed the House on the reverse coalition, and HB44's four-plex mandate failed with Republicans opposed roughly eight to one and Democrats split. Tenant-cost bills die in the House under both parties' majorities — the Inexpedient to Legislate motion is the single largest killer in the set, with 51 housing bills killed in 2026 alone. Some decisive outcomes left no roll call at all: SB454's tabling and HB1291's 2024 Senate death were unrecorded votes. Five 2025 Senate housing bills died at the Senate's Rule 3-23 deadline rather than on the merits. Since 2020 the Governor has vetoed three housing bills: the COVID eviction pause (HB1247, 2020, override failed 187–148), the manufactured-housing boards bill (SB318, 2024), and the deposit-cap exception (HB1336, 2026). Frequent carriers where party records exist: Reps. Joe Alexander (R) and Ellen Read (D) and Sen. Keith Murphy (R) on seven, six, and five bills.</w:t>
       </w:r>
     </w:p>
     <w:p>

</xml_diff>